<commit_message>
Aggiungi il Racconto di prova come percorso alternativo al Pitch
Chi non ha esperienza con il formato tecnico del Kit puo' ora proporre
una storia scrivendola liberamente come un racconto; la sceneggiatura
la prepariamo noi a partire dal testo. Aggiornate le pagine Community
e Regolamento (IT/EN) e i documenti del Kit di conseguenza.

Co-Authored-By: Claude Sonnet 5 <noreply@anthropic.com>
</commit_message>
<xml_diff>
--- a/kit/DungeonLegacy-Kit-01-Guida-IT.docx
+++ b/kit/DungeonLegacy-Kit-01-Guida-IT.docx
@@ -2,7 +2,7 @@
 <file path=word/document.xml><?xml version="1.0" encoding="utf-8"?>
 <w:document xmlns:w="http://schemas.openxmlformats.org/wordprocessingml/2006/main" xmlns:m="http://schemas.openxmlformats.org/officeDocument/2006/math" xmlns:r="http://schemas.openxmlformats.org/officeDocument/2006/relationships" xmlns:o="urn:schemas-microsoft-com:office:office" xmlns:v="urn:schemas-microsoft-com:vml" xmlns:w10="urn:schemas-microsoft-com:office:word" xmlns:a="http://schemas.openxmlformats.org/drawingml/2006/main" xmlns:pic="http://schemas.openxmlformats.org/drawingml/2006/picture" xmlns:wp="http://schemas.openxmlformats.org/drawingml/2006/wordprocessingDrawing">
   <w:body>
-    <w:bookmarkStart w:id="34" w:name="Xc6fa08c1961bc8120e82f2736e702d3b0c88f35"/>
+    <w:bookmarkStart w:id="35" w:name="Xc6fa08c1961bc8120e82f2736e702d3b0c88f35"/>
     <w:p>
       <w:pPr>
         <w:pStyle w:val="Heading1"/>
@@ -627,7 +627,7 @@
       </w:r>
     </w:p>
     <w:bookmarkEnd w:id="10"/>
-    <w:bookmarkStart w:id="11" w:name="Xd019e949551da12f748458aa9dba80a49fba216"/>
+    <w:bookmarkStart w:id="12" w:name="Xd019e949551da12f748458aa9dba80a49fba216"/>
     <w:p>
       <w:pPr>
         <w:pStyle w:val="Heading2"/>
@@ -649,13 +649,26 @@
           <w:b/>
           <w:bCs/>
         </w:rPr>
+        <w:t xml:space="preserve">Testo di prova</w:t>
+      </w:r>
+      <w:r>
+        <w:t xml:space="preserve">: un</w:t>
+      </w:r>
+      <w:r>
+        <w:t xml:space="preserve"> </w:t>
+      </w:r>
+      <w:r>
+        <w:rPr>
+          <w:b/>
+          <w:bCs/>
+        </w:rPr>
         <w:t xml:space="preserve">Pitch</w:t>
       </w:r>
       <w:r>
         <w:t xml:space="preserve"> </w:t>
       </w:r>
       <w:r>
-        <w:t xml:space="preserve">(1-2 pagine): premessa, eroi, elenco dei capitoli, finale. Lo mandi entro la scadenza della Call.</w:t>
+        <w:t xml:space="preserve">(1-2 pagine: premessa, eroi, elenco dei capitoli, finale) oppure, se preferisci, l'inizio della tua storia scritto come un racconto (vedi la sezione qui sotto). Lo mandi entro la scadenza della Call.</w:t>
       </w:r>
     </w:p>
     <w:p>
@@ -847,6 +860,49 @@
       </w:r>
       <w:r>
         <w:t xml:space="preserve">di inviare il Modulo completo.</w:t>
+      </w:r>
+    </w:p>
+    <w:bookmarkStart w:id="11" w:name="Xade0626b116c051c182d755260314f2e3564f1d"/>
+    <w:p>
+      <w:pPr>
+        <w:pStyle w:val="Heading3"/>
+      </w:pPr>
+      <w:r>
+        <w:t xml:space="preserve">Non hai dimestichezza? Scrivila come un racconto</w:t>
+      </w:r>
+    </w:p>
+    <w:p>
+      <w:pPr>
+        <w:pStyle w:val="FirstParagraph"/>
+      </w:pPr>
+      <w:r>
+        <w:t xml:space="preserve">Questa Guida e il Modulo sono per chi ama costruire la storia per luoghi, incontri e scelte. Se hai una storia ma non sai da dove cominciare,</w:t>
+      </w:r>
+      <w:r>
+        <w:t xml:space="preserve"> </w:t>
+      </w:r>
+      <w:r>
+        <w:rPr>
+          <w:b/>
+          <w:bCs/>
+        </w:rPr>
+        <w:t xml:space="preserve">puoi saltare tutto questo</w:t>
+      </w:r>
+      <w:r>
+        <w:t xml:space="preserve">: scrivila come un tema, un racconto o un romanzo breve, con le tue parole, e mandacela come testo di prova (l'inizio, i personaggi, il luogo e, in poche righe, come va a finire; non serve averla finita). Se la scegliamo,</w:t>
+      </w:r>
+      <w:r>
+        <w:t xml:space="preserve"> </w:t>
+      </w:r>
+      <w:r>
+        <w:rPr>
+          <w:b/>
+          <w:bCs/>
+        </w:rPr>
+        <w:t xml:space="preserve">la trasformazione in capitoli, scene e dialoghi la facciamo noi</w:t>
+      </w:r>
+      <w:r>
+        <w:t xml:space="preserve">, preparando il Modulo dal tuo testo e rivedendolo insieme a te. Come per il Pitch, in questa fase non cedi nessun diritto.</w:t>
       </w:r>
     </w:p>
     <w:p>
@@ -857,7 +913,8 @@
       </w:r>
     </w:p>
     <w:bookmarkEnd w:id="11"/>
-    <w:bookmarkStart w:id="18" w:name="X4c2ddaa7538271e4ffe82f7cf039c4735fb3f35"/>
+    <w:bookmarkEnd w:id="12"/>
+    <w:bookmarkStart w:id="19" w:name="X4c2ddaa7538271e4ffe82f7cf039c4735fb3f35"/>
     <w:p>
       <w:pPr>
         <w:pStyle w:val="Heading2"/>
@@ -887,7 +944,7 @@
         <w:t xml:space="preserve">. Rispettarli è più importante di qualunque colpo di scena.</w:t>
       </w:r>
     </w:p>
-    <w:bookmarkStart w:id="12" w:name="X9cc218c1ef2b147a36f614181ce4aef8a0f61eb"/>
+    <w:bookmarkStart w:id="13" w:name="X9cc218c1ef2b147a36f614181ce4aef8a0f61eb"/>
     <w:p>
       <w:pPr>
         <w:pStyle w:val="Heading3"/>
@@ -1504,8 +1561,8 @@
         <w:t xml:space="preserve">.</w:t>
       </w:r>
     </w:p>
-    <w:bookmarkEnd w:id="12"/>
-    <w:bookmarkStart w:id="13" w:name="X9c504a72db6d0d8929455048c6237d7a1cd1068"/>
+    <w:bookmarkEnd w:id="13"/>
+    <w:bookmarkStart w:id="14" w:name="X9c504a72db6d0d8929455048c6237d7a1cd1068"/>
     <w:p>
       <w:pPr>
         <w:pStyle w:val="Heading3"/>
@@ -1567,8 +1624,8 @@
         <w:t xml:space="preserve">.</w:t>
       </w:r>
     </w:p>
-    <w:bookmarkEnd w:id="13"/>
-    <w:bookmarkStart w:id="14" w:name="X4dfffaeeffb88faf7b5235c395f052b65f71494"/>
+    <w:bookmarkEnd w:id="14"/>
+    <w:bookmarkStart w:id="15" w:name="X4dfffaeeffb88faf7b5235c395f052b65f71494"/>
     <w:p>
       <w:pPr>
         <w:pStyle w:val="Heading3"/>
@@ -1642,8 +1699,8 @@
         <w:t xml:space="preserve">il gioco deve reggere la perdita di un compagno.</w:t>
       </w:r>
     </w:p>
-    <w:bookmarkEnd w:id="14"/>
-    <w:bookmarkStart w:id="15" w:name="Xf29f1335949da6b53bfe09ab6cd64942dcd59e6"/>
+    <w:bookmarkEnd w:id="15"/>
+    <w:bookmarkStart w:id="16" w:name="Xf29f1335949da6b53bfe09ab6cd64942dcd59e6"/>
     <w:p>
       <w:pPr>
         <w:pStyle w:val="Heading3"/>
@@ -1711,8 +1768,8 @@
         <w:t xml:space="preserve">. (Vedi «Segreti e Reperti», sez. 8.)</w:t>
       </w:r>
     </w:p>
-    <w:bookmarkEnd w:id="15"/>
-    <w:bookmarkStart w:id="16" w:name="X01433fd78b89267afc290b0167d65996a341be1"/>
+    <w:bookmarkEnd w:id="16"/>
+    <w:bookmarkStart w:id="17" w:name="X01433fd78b89267afc290b0167d65996a341be1"/>
     <w:p>
       <w:pPr>
         <w:pStyle w:val="Heading3"/>
@@ -1773,8 +1830,8 @@
         <w:t xml:space="preserve">un mantello che attutisce i colpi); i valori li assegniamo noi seguendo la nostra politica di ricompense.</w:t>
       </w:r>
     </w:p>
-    <w:bookmarkEnd w:id="16"/>
-    <w:bookmarkStart w:id="17" w:name="Xa4c87dd2dc597d564688df75fc1856666072ff6"/>
+    <w:bookmarkEnd w:id="17"/>
+    <w:bookmarkStart w:id="18" w:name="Xa4c87dd2dc597d564688df75fc1856666072ff6"/>
     <w:p>
       <w:pPr>
         <w:pStyle w:val="Heading3"/>
@@ -1892,9 +1949,9 @@
         </w:pict>
       </w:r>
     </w:p>
-    <w:bookmarkEnd w:id="17"/>
     <w:bookmarkEnd w:id="18"/>
-    <w:bookmarkStart w:id="19" w:name="X654e00ce99905383a4d012c07e96f78ce84032b"/>
+    <w:bookmarkEnd w:id="19"/>
+    <w:bookmarkStart w:id="20" w:name="X654e00ce99905383a4d012c07e96f78ce84032b"/>
     <w:p>
       <w:pPr>
         <w:pStyle w:val="Heading2"/>
@@ -2466,8 +2523,8 @@
         </w:pict>
       </w:r>
     </w:p>
-    <w:bookmarkEnd w:id="19"/>
-    <w:bookmarkStart w:id="20" w:name="X351e146d0ba732b4d05a5d51fe0ef49de489b33"/>
+    <w:bookmarkEnd w:id="20"/>
+    <w:bookmarkStart w:id="21" w:name="X351e146d0ba732b4d05a5d51fe0ef49de489b33"/>
     <w:p>
       <w:pPr>
         <w:pStyle w:val="Heading2"/>
@@ -2861,8 +2918,8 @@
         </w:pict>
       </w:r>
     </w:p>
-    <w:bookmarkEnd w:id="20"/>
-    <w:bookmarkStart w:id="21" w:name="X7763629ba239252e9878321b1548feafe6a84a0"/>
+    <w:bookmarkEnd w:id="21"/>
+    <w:bookmarkStart w:id="22" w:name="X7763629ba239252e9878321b1548feafe6a84a0"/>
     <w:p>
       <w:pPr>
         <w:pStyle w:val="Heading2"/>
@@ -3271,8 +3328,8 @@
         </w:pict>
       </w:r>
     </w:p>
-    <w:bookmarkEnd w:id="21"/>
-    <w:bookmarkStart w:id="26" w:name="X88cb4aa21b5808ff1115c81e49b08e339d6f62d"/>
+    <w:bookmarkEnd w:id="22"/>
+    <w:bookmarkStart w:id="27" w:name="X88cb4aa21b5808ff1115c81e49b08e339d6f62d"/>
     <w:p>
       <w:pPr>
         <w:pStyle w:val="Heading2"/>
@@ -3281,7 +3338,7 @@
         <w:t xml:space="preserve">8. Ricompense, segreti e completamento</w:t>
       </w:r>
     </w:p>
-    <w:bookmarkStart w:id="22" w:name="X6231942a3035f24613ba19a7c7c979ac7706416"/>
+    <w:bookmarkStart w:id="23" w:name="X6231942a3035f24613ba19a7c7c979ac7706416"/>
     <w:p>
       <w:pPr>
         <w:pStyle w:val="Heading3"/>
@@ -3311,8 +3368,8 @@
         <w:t xml:space="preserve">. I numeri li mettiamo noi.</w:t>
       </w:r>
     </w:p>
-    <w:bookmarkEnd w:id="22"/>
-    <w:bookmarkStart w:id="23" w:name="X598e4ed23d70847c14066fbc1b28eb2137d62c4"/>
+    <w:bookmarkEnd w:id="23"/>
+    <w:bookmarkStart w:id="24" w:name="X598e4ed23d70847c14066fbc1b28eb2137d62c4"/>
     <w:p>
       <w:pPr>
         <w:pStyle w:val="Heading3"/>
@@ -3436,8 +3493,8 @@
         <w:t xml:space="preserve">.</w:t>
       </w:r>
     </w:p>
-    <w:bookmarkEnd w:id="23"/>
-    <w:bookmarkStart w:id="24" w:name="X20418e3b78954fe584fc6906e0031c81c434aa8"/>
+    <w:bookmarkEnd w:id="24"/>
+    <w:bookmarkStart w:id="25" w:name="X20418e3b78954fe584fc6906e0031c81c434aa8"/>
     <w:p>
       <w:pPr>
         <w:pStyle w:val="Heading3"/>
@@ -3590,8 +3647,8 @@
         <w:t xml:space="preserve">.</w:t>
       </w:r>
     </w:p>
-    <w:bookmarkEnd w:id="24"/>
-    <w:bookmarkStart w:id="25" w:name="X2fa7d84f2aa72ad6da8f5398f141ffc40e95dfd"/>
+    <w:bookmarkEnd w:id="25"/>
+    <w:bookmarkStart w:id="26" w:name="X2fa7d84f2aa72ad6da8f5398f141ffc40e95dfd"/>
     <w:p>
       <w:pPr>
         <w:pStyle w:val="Heading3"/>
@@ -3657,9 +3714,9 @@
         </w:pict>
       </w:r>
     </w:p>
-    <w:bookmarkEnd w:id="25"/>
     <w:bookmarkEnd w:id="26"/>
-    <w:bookmarkStart w:id="27" w:name="Xb00004ca12d8dd8af9a59542725431778a9d2fd"/>
+    <w:bookmarkEnd w:id="27"/>
+    <w:bookmarkStart w:id="28" w:name="Xb00004ca12d8dd8af9a59542725431778a9d2fd"/>
     <w:p>
       <w:pPr>
         <w:pStyle w:val="Heading2"/>
@@ -3866,8 +3923,8 @@
         </w:pict>
       </w:r>
     </w:p>
-    <w:bookmarkEnd w:id="27"/>
-    <w:bookmarkStart w:id="28" w:name="Xb57a676a1224b2c4c6c81d1a0323e9478d95e5b"/>
+    <w:bookmarkEnd w:id="28"/>
+    <w:bookmarkStart w:id="29" w:name="Xb57a676a1224b2c4c6c81d1a0323e9478d95e5b"/>
     <w:p>
       <w:pPr>
         <w:pStyle w:val="Heading2"/>
@@ -4072,8 +4129,8 @@
         </w:pict>
       </w:r>
     </w:p>
-    <w:bookmarkEnd w:id="28"/>
-    <w:bookmarkStart w:id="29" w:name="X87628f1f21d62ed8aee84dce9671d0f3f084308"/>
+    <w:bookmarkEnd w:id="29"/>
+    <w:bookmarkStart w:id="30" w:name="X87628f1f21d62ed8aee84dce9671d0f3f084308"/>
     <w:p>
       <w:pPr>
         <w:pStyle w:val="Heading2"/>
@@ -4180,8 +4237,8 @@
         </w:pict>
       </w:r>
     </w:p>
-    <w:bookmarkEnd w:id="29"/>
-    <w:bookmarkStart w:id="30" w:name="Xf1873db451bb37490b35ae1f522ebc09730aee7"/>
+    <w:bookmarkEnd w:id="30"/>
+    <w:bookmarkStart w:id="31" w:name="Xf1873db451bb37490b35ae1f522ebc09730aee7"/>
     <w:p>
       <w:pPr>
         <w:pStyle w:val="Heading2"/>
@@ -4417,8 +4474,8 @@
         </w:pict>
       </w:r>
     </w:p>
-    <w:bookmarkEnd w:id="30"/>
-    <w:bookmarkStart w:id="31" w:name="Xcebcab6456aba446169320ce5aa660ef1d76bae"/>
+    <w:bookmarkEnd w:id="31"/>
+    <w:bookmarkStart w:id="32" w:name="Xcebcab6456aba446169320ce5aa660ef1d76bae"/>
     <w:p>
       <w:pPr>
         <w:pStyle w:val="Heading2"/>
@@ -4633,8 +4690,8 @@
         </w:tc>
       </w:tr>
     </w:tbl>
-    <w:bookmarkEnd w:id="31"/>
-    <w:bookmarkStart w:id="33" w:name="Xd5136473e39541bbe6ef45cd594c9c2b6601a8b"/>
+    <w:bookmarkEnd w:id="32"/>
+    <w:bookmarkStart w:id="34" w:name="Xd5136473e39541bbe6ef45cd594c9c2b6601a8b"/>
     <w:p>
       <w:pPr>
         <w:pStyle w:val="Heading2"/>
@@ -4948,7 +5005,7 @@
       <w:r>
         <w:t xml:space="preserve"> </w:t>
       </w:r>
-      <w:hyperlink r:id="rId32">
+      <w:hyperlink r:id="rId33">
         <w:r>
           <w:rPr>
             <w:rStyle w:val="Hyperlink"/>
@@ -4968,8 +5025,8 @@
         <w:t xml:space="preserve">Buon lavoro.</w:t>
       </w:r>
     </w:p>
-    <w:bookmarkEnd w:id="33"/>
     <w:bookmarkEnd w:id="34"/>
+    <w:bookmarkEnd w:id="35"/>
     <w:sectPr>
       <w:footnotePr>
         <w:numRestart w:val="eachSect"/>

</xml_diff>